<commit_message>
chore: re-verify all 68 files after renaming fictional organizations in samples
Co-Authored-By: Claude Opus 5.5 <noreply@anthropic.com>
Claude-Session: https://claude.ai/code/session_018Hh9hVBWfKtt47QQkPMoFc
</commit_message>
<xml_diff>
--- a/fixtures/compact/compact-cover-letter-a4.docx
+++ b/fixtures/compact/compact-cover-letter-a4.docx
@@ -140,7 +140,7 @@
         <w:rPr>
           <w:rtl w:val="0"/>
         </w:rPr>
-        <w:t xml:space="preserve">When I joined Peachtree, on-time inbound delivery was 87% and nobody trusted the carrier numbers. I built a weekly scorecard, sat down with each of our nine truckload carriers, and renegotiated every contract. On-time delivery is now 95%, and we save about $2.1M a year.</w:t>
+        <w:t xml:space="preserve">When I joined Red Clay Hearth, on-time inbound delivery was 87% and nobody trusted the carrier numbers. I built a weekly scorecard, sat down with each of our nine truckload carriers, and renegotiated every contract. On-time delivery is now 95%, and we save about $2.1M a year.</w:t>
       </w:r>
     </w:p>
     <w:p>
@@ -153,7 +153,7 @@
         <w:rPr>
           <w:rtl w:val="0"/>
         </w:rPr>
-        <w:t xml:space="preserve">Grocery is a different pace, and I know that. Before Peachtree I worked on 120 lanes at Corridor Freight, many of them for food shippers, so I'm used to short windows and cold-chain rules.</w:t>
+        <w:t xml:space="preserve">Grocery is a different pace, and I know that. Before Red Clay Hearth I worked on 120 lanes at Brassmoor Freight, many of them for food shippers, so I'm used to short windows and cold-chain rules.</w:t>
       </w:r>
     </w:p>
     <w:p>

</xml_diff>